<commit_message>
actualización portada de informe
</commit_message>
<xml_diff>
--- a/Documentación/aptc106_s11grupo4.docx
+++ b/Documentación/aptc106_s11grupo4.docx
@@ -2,6 +2,49 @@
 <file path=word/document.xml><?xml version="1.0" encoding="utf-8"?>
 <w:document xmlns:wpc="http://schemas.microsoft.com/office/word/2010/wordprocessingCanvas" xmlns:mo="http://schemas.microsoft.com/office/mac/office/2008/main" xmlns:mc="http://schemas.openxmlformats.org/markup-compatibility/2006" xmlns:mv="urn:schemas-microsoft-com:mac:vml" xmlns:o="urn:schemas-microsoft-com:office:office" xmlns:r="http://schemas.openxmlformats.org/officeDocument/2006/relationships" xmlns:m="http://schemas.openxmlformats.org/officeDocument/2006/math" xmlns:v="urn:schemas-microsoft-com:vml" xmlns:wp14="http://schemas.microsoft.com/office/word/2010/wordprocessingDrawing" xmlns:wp="http://schemas.openxmlformats.org/drawingml/2006/wordprocessingDrawing" xmlns:w10="urn:schemas-microsoft-com:office:word" xmlns:w="http://schemas.openxmlformats.org/wordprocessingml/2006/main" xmlns:w14="http://schemas.microsoft.com/office/word/2010/wordml" xmlns:wpg="http://schemas.microsoft.com/office/word/2010/wordprocessingGroup" xmlns:wpi="http://schemas.microsoft.com/office/word/2010/wordprocessingInk" xmlns:wne="http://schemas.microsoft.com/office/word/2006/wordml" xmlns:wps="http://schemas.microsoft.com/office/word/2010/wordprocessingShape" mc:Ignorable="w14 wp14">
   <w:body>
+    <w:p>
+      <w:pPr>
+        <w:jc w:val="right"/>
+      </w:pPr>
+      <w:r>
+        <w:drawing>
+          <wp:inline xmlns:a="http://schemas.openxmlformats.org/drawingml/2006/main" xmlns:pic="http://schemas.openxmlformats.org/drawingml/2006/picture">
+            <wp:extent cx="2194560" cy="857250"/>
+            <wp:docPr id="1" name="Picture 1"/>
+            <wp:cNvGraphicFramePr>
+              <a:graphicFrameLocks noChangeAspect="1"/>
+            </wp:cNvGraphicFramePr>
+            <a:graphic>
+              <a:graphicData uri="http://schemas.openxmlformats.org/drawingml/2006/picture">
+                <pic:pic>
+                  <pic:nvPicPr>
+                    <pic:cNvPr id="0" name="unab-logo.jpg"/>
+                    <pic:cNvPicPr/>
+                  </pic:nvPicPr>
+                  <pic:blipFill>
+                    <a:blip r:embed="rId10"/>
+                    <a:stretch>
+                      <a:fillRect/>
+                    </a:stretch>
+                  </pic:blipFill>
+                  <pic:spPr>
+                    <a:xfrm>
+                      <a:off x="0" y="0"/>
+                      <a:ext cx="2194560" cy="857250"/>
+                    </a:xfrm>
+                    <a:prstGeom prst="rect"/>
+                  </pic:spPr>
+                </pic:pic>
+              </a:graphicData>
+            </a:graphic>
+          </wp:inline>
+        </w:drawing>
+      </w:r>
+    </w:p>
+    <w:p/>
+    <w:p/>
+    <w:p/>
+    <w:p/>
     <w:p/>
     <w:p/>
     <w:p>
@@ -11,21 +54,9 @@
       <w:r>
         <w:rPr>
           <w:b/>
-          <w:sz w:val="26"/>
-        </w:rPr>
-        <w:t>APTC106 — Taller de Desarrollo Web y Móvil</w:t>
-      </w:r>
-    </w:p>
-    <w:p>
-      <w:pPr>
-        <w:jc w:val="center"/>
-      </w:pPr>
-      <w:r>
-        <w:rPr>
-          <w:b w:val="0"/>
           <w:sz w:val="24"/>
         </w:rPr>
-        <w:t>Semana 11 · Sumativa 4</w:t>
+        <w:t>APTC106</w:t>
       </w:r>
     </w:p>
     <w:p>
@@ -35,21 +66,9 @@
       <w:r>
         <w:rPr>
           <w:b/>
-          <w:sz w:val="36"/>
-        </w:rPr>
-        <w:t>Propuesta de Solución</w:t>
-      </w:r>
-    </w:p>
-    <w:p>
-      <w:pPr>
-        <w:jc w:val="center"/>
-      </w:pPr>
-      <w:r>
-        <w:rPr>
-          <w:b w:val="0"/>
           <w:sz w:val="24"/>
         </w:rPr>
-        <w:t>Sistema de Logística Inversa «TWOLIFE»</w:t>
+        <w:t>Semana 11 – Sumativa 4</w:t>
       </w:r>
     </w:p>
     <w:p/>
@@ -63,41 +82,62 @@
       <w:r>
         <w:rPr>
           <w:b/>
+          <w:sz w:val="36"/>
         </w:rPr>
-        <w:t>Grupo 4</w:t>
+        <w:t>Propuesta de Solución</w:t>
       </w:r>
     </w:p>
+    <w:p/>
+    <w:p/>
+    <w:p/>
+    <w:p/>
+    <w:p/>
+    <w:p/>
+    <w:p/>
+    <w:p/>
+    <w:p/>
     <w:p>
       <w:pPr>
-        <w:jc w:val="center"/>
+        <w:jc w:val="left"/>
       </w:pPr>
       <w:r>
         <w:rPr>
           <w:b w:val="0"/>
         </w:rPr>
-        <w:t>Integrantes: Joaquín Olivares · Javiera Chávez · Claudio Yáñez</w:t>
+        <w:t>Integrantes: Joaquín Olivares, Javiera Chávez, Claudio Yáñez.</w:t>
       </w:r>
     </w:p>
     <w:p>
       <w:pPr>
-        <w:jc w:val="center"/>
+        <w:jc w:val="left"/>
       </w:pPr>
       <w:r>
         <w:rPr>
           <w:b w:val="0"/>
         </w:rPr>
-        <w:t>Docente: Ernesto Vivanco Tapia</w:t>
+        <w:t>Asignatura: Desarrollo Web y Móvil.</w:t>
       </w:r>
     </w:p>
     <w:p>
       <w:pPr>
-        <w:jc w:val="center"/>
+        <w:jc w:val="left"/>
       </w:pPr>
       <w:r>
         <w:rPr>
           <w:b w:val="0"/>
         </w:rPr>
-        <w:t>Fecha: 07 de septiembre de 2026</w:t>
+        <w:t>Docente: Ernesto Vivanco Tapia.</w:t>
+      </w:r>
+    </w:p>
+    <w:p>
+      <w:pPr>
+        <w:jc w:val="left"/>
+      </w:pPr>
+      <w:r>
+        <w:rPr>
+          <w:b w:val="0"/>
+        </w:rPr>
+        <w:t>Fecha: 07 de septiembre de 2026.</w:t>
       </w:r>
     </w:p>
     <w:p>
@@ -1625,13 +1665,32 @@
       </w:r>
     </w:p>
     <w:sectPr>
+      <w:headerReference w:type="default" r:id="rId9"/>
       <w:pgSz w:w="12240" w:h="15840"/>
-      <w:pgMar w:top="1440" w:right="1440" w:bottom="1440" w:left="1440" w:header="720" w:footer="720" w:gutter="0"/>
+      <w:pgMar w:top="1440" w:right="1440" w:bottom="1440" w:left="1440" w:header="576" w:footer="720" w:gutter="0"/>
       <w:cols w:space="720"/>
       <w:docGrid w:linePitch="360"/>
     </w:sectPr>
   </w:body>
 </w:document>
+</file>
+
+<file path=word/header1.xml><?xml version="1.0" encoding="utf-8"?>
+<w:hdr xmlns:m="http://schemas.openxmlformats.org/officeDocument/2006/math" xmlns:mc="http://schemas.openxmlformats.org/markup-compatibility/2006" xmlns:mo="http://schemas.microsoft.com/office/mac/office/2008/main" xmlns:mv="urn:schemas-microsoft-com:mac:vml" xmlns:o="urn:schemas-microsoft-com:office:office" xmlns:r="http://schemas.openxmlformats.org/officeDocument/2006/relationships" xmlns:v="urn:schemas-microsoft-com:vml" xmlns:w10="urn:schemas-microsoft-com:office:word" xmlns:w14="http://schemas.microsoft.com/office/word/2010/wordml" xmlns:w="http://schemas.openxmlformats.org/wordprocessingml/2006/main" xmlns:wne="http://schemas.microsoft.com/office/word/2006/wordml" xmlns:wp14="http://schemas.microsoft.com/office/word/2010/wordprocessingDrawing" xmlns:wp="http://schemas.openxmlformats.org/drawingml/2006/wordprocessingDrawing" xmlns:wpc="http://schemas.microsoft.com/office/word/2010/wordprocessingCanvas" xmlns:wpg="http://schemas.microsoft.com/office/word/2010/wordprocessingGroup" xmlns:wpi="http://schemas.microsoft.com/office/word/2010/wordprocessingInk" xmlns:wps="http://schemas.microsoft.com/office/word/2010/wordprocessingShape" mc:Ignorable="w14 wp14">
+  <w:p>
+    <w:pPr>
+      <w:pStyle w:val="Header"/>
+      <w:jc w:val="right"/>
+    </w:pPr>
+    <w:r>
+      <w:rPr>
+        <w:color w:val="606060"/>
+        <w:sz w:val="18"/>
+      </w:rPr>
+      <w:t>APTC106 – Sumativa 4</w:t>
+    </w:r>
+  </w:p>
+</w:hdr>
 </file>
 
 <file path=word/numbering.xml><?xml version="1.0" encoding="utf-8"?>
@@ -1998,7 +2057,7 @@
     <w:qFormat/>
     <w:rsid w:val="00FC693F"/>
     <w:pPr>
-      <w:spacing w:line="276" w:lineRule="auto" w:after="120"/>
+      <w:spacing w:line="276" w:lineRule="auto" w:after="80"/>
       <w:jc w:val="both"/>
     </w:pPr>
     <w:rPr>
@@ -2061,7 +2120,7 @@
     <w:pPr>
       <w:keepNext/>
       <w:keepLines/>
-      <w:spacing w:before="240" w:after="80"/>
+      <w:spacing w:before="200" w:after="60"/>
       <w:jc w:val="left"/>
       <w:outlineLvl w:val="0"/>
     </w:pPr>
@@ -2086,7 +2145,7 @@
     <w:pPr>
       <w:keepNext/>
       <w:keepLines/>
-      <w:spacing w:before="240" w:after="80"/>
+      <w:spacing w:before="200" w:after="60"/>
       <w:jc w:val="left"/>
       <w:outlineLvl w:val="1"/>
     </w:pPr>
@@ -2111,7 +2170,7 @@
     <w:pPr>
       <w:keepNext/>
       <w:keepLines/>
-      <w:spacing w:before="240" w:after="80"/>
+      <w:spacing w:before="200" w:after="60"/>
       <w:jc w:val="left"/>
       <w:outlineLvl w:val="2"/>
     </w:pPr>

</xml_diff>

<commit_message>
actualización de README e Informe
</commit_message>
<xml_diff>
--- a/Documentación/aptc106_s11grupo4.docx
+++ b/Documentación/aptc106_s11grupo4.docx
@@ -448,7 +448,26 @@
         <w:rPr>
           <w:b w:val="0"/>
         </w:rPr>
-        <w:t>El proyecto está versionado con Git y subido a GitHub, con un README que explica paso a paso cómo instalarlo (entorno virtual, dependencias, migraciones y ejecución) para que se pueda correr en otro computador. Para el despliegue armamos una página de presentación estática (carpeta docs del repositorio) pensada para publicarse con GitHub Pages: muestra de qué se trata el sistema, los roles, el flujo y capturas de la aplicación funcionando, con enlace al repositorio y al README. Como Django es dinámico y GitHub Pages solo sirve páginas estáticas, esta página funciona como evidencia de despliegue; la parte dinámica (login y CRUD) se ejecuta localmente siguiendo el README, y en el capítulo 4 mostramos que funciona.</w:t>
+        <w:t>El proyecto está versionado con Git y subido a GitHub, con un README que explica paso a paso cómo instalarlo (entorno virtual, dependencias, migraciones y ejecución) para que se pueda correr en otro computador. Para el despliegue publicamos con GitHub Pages una página de presentación estática (carpeta docs del repositorio) que muestra de qué se trata el sistema, los roles, el flujo y capturas de la aplicación funcionando, con enlace al repositorio y al README. Está disponible en:</w:t>
+      </w:r>
+    </w:p>
+    <w:p>
+      <w:pPr>
+        <w:spacing w:after="80"/>
+      </w:pPr>
+      <w:r>
+        <w:rPr>
+          <w:sz w:val="20"/>
+        </w:rPr>
+        <w:t>https://saiya129.github.io/Desarrollo_web_movil/</w:t>
+      </w:r>
+    </w:p>
+    <w:p>
+      <w:r>
+        <w:rPr>
+          <w:b w:val="0"/>
+        </w:rPr>
+        <w:t>Como Django es dinámico y GitHub Pages solo sirve páginas estáticas, esta página funciona como evidencia de despliegue; la parte dinámica (login y CRUD) se ejecuta localmente siguiendo el README, y en el capítulo 4 mostramos que funciona.</w:t>
       </w:r>
     </w:p>
     <w:p>
@@ -1546,7 +1565,7 @@
         <w:rPr>
           <w:b w:val="0"/>
         </w:rPr>
-        <w:t>Sobre los objetivos específicos: integramos las mejoras y conclusiones del informe anterior (el MVP pasó de una solicitud de devolución a un flujo completo de Marketplace y logística, con borrado lógico, EAN y coordinación del retiro); armamos el prototipo móvil navegable siguiendo la arquitectura definida; y dejamos el proyecto en un repositorio con README reproducible y una página de presentación lista para publicar con GitHub Pages. Lo que quedó a medias es que el prototipo móvil no está empaquetado como app híbrida y el backend no está desplegado en línea.</w:t>
+        <w:t>Sobre los objetivos específicos: integramos las mejoras y conclusiones del informe anterior (el MVP pasó de una solicitud de devolución a un flujo completo de Marketplace y logística, con borrado lógico, EAN y coordinación del retiro); armamos el prototipo móvil navegable siguiendo la arquitectura definida; y dejamos el proyecto en un repositorio con README reproducible y la página de presentación publicada con GitHub Pages. Lo que quedó a medias es que el prototipo móvil no está empaquetado como app híbrida y el backend dinámico no está desplegado en línea.</w:t>
       </w:r>
     </w:p>
     <w:p>

</xml_diff>